<commit_message>
add link video ytb
</commit_message>
<xml_diff>
--- a/LAB5/11CNPM2_LAB5_1150080156-NguyenHoTruongTam.docx
+++ b/LAB5/11CNPM2_LAB5_1150080156-NguyenHoTruongTam.docx
@@ -134,16 +134,41 @@
       <w:r>
         <w:rPr>
           <w:b/>
+          <w:lang w:val="vi-VN"/>
         </w:rPr>
-        <w:t xml:space="preserve">Link video: </w:t>
+        <w:t>Link video</w:t>
+      </w:r>
+      <w:r>
+        <w:rPr>
+          <w:b/>
+          <w:lang w:val="vi-VN"/>
+        </w:rPr>
+        <w:t xml:space="preserve">: </w:t>
       </w:r>
       <w:hyperlink r:id="rId7" w:history="1">
         <w:r>
           <w:rPr>
             <w:rStyle w:val="Hyperlink"/>
             <w:bCs/>
+            <w:lang w:val="vi-VN"/>
           </w:rPr>
-          <w:t>https://youtu.be/_oHc97dM9_M</w:t>
+          <w:t>https://youtu.be/VNAbaU2CN_E?si=-yRjbO7p</w:t>
+        </w:r>
+        <w:r>
+          <w:rPr>
+            <w:rStyle w:val="Hyperlink"/>
+            <w:bCs/>
+            <w:lang w:val="vi-VN"/>
+          </w:rPr>
+          <w:t>X</w:t>
+        </w:r>
+        <w:r>
+          <w:rPr>
+            <w:rStyle w:val="Hyperlink"/>
+            <w:bCs/>
+            <w:lang w:val="vi-VN"/>
+          </w:rPr>
+          <w:t>UpJqzC_</w:t>
         </w:r>
       </w:hyperlink>
     </w:p>
@@ -403,6 +428,7 @@
       </w:pPr>
       <w:r>
         <w:rPr>
+          <w:noProof/>
           <w:lang w:val="vi-VN"/>
         </w:rPr>
         <w:drawing>
@@ -635,6 +661,7 @@
       </w:pPr>
       <w:r>
         <w:rPr>
+          <w:noProof/>
           <w:lang w:val="vi-VN"/>
         </w:rPr>
         <w:drawing>
@@ -695,6 +722,7 @@
       </w:pPr>
       <w:r>
         <w:rPr>
+          <w:noProof/>
           <w:lang w:val="vi-VN"/>
         </w:rPr>
         <w:lastRenderedPageBreak/>
@@ -770,6 +798,7 @@
       </w:pPr>
       <w:r>
         <w:rPr>
+          <w:noProof/>
           <w:lang w:val="vi-VN"/>
         </w:rPr>
         <w:drawing>
@@ -12944,6 +12973,18 @@
       <w:shd w:val="clear" w:color="auto" w:fill="E1DFDD"/>
     </w:rPr>
   </w:style>
+  <w:style w:type="character" w:styleId="FollowedHyperlink">
+    <w:name w:val="FollowedHyperlink"/>
+    <w:basedOn w:val="DefaultParagraphFont"/>
+    <w:uiPriority w:val="99"/>
+    <w:semiHidden/>
+    <w:unhideWhenUsed/>
+    <w:rsid w:val="00C921A3"/>
+    <w:rPr>
+      <w:color w:val="800080" w:themeColor="followedHyperlink"/>
+      <w:u w:val="single"/>
+    </w:rPr>
+  </w:style>
 </w:styles>
 </file>
 

</xml_diff>